<commit_message>
Refine Gao Jiansong resume wording and highlights
Co-authored-by: xiaoxiaosongss <xiaoxiaosongss@users.noreply.github.com>
</commit_message>
<xml_diff>
--- a/gao-jiansong-java-resume.docx
+++ b/gao-jiansong-java-resume.docx
@@ -73,7 +73,7 @@
         <w:pStyle w:val="ListBullet"/>
       </w:pPr>
       <w:r>
-        <w:t>10年后端开发经验，其中8年专注金融核心系统，拥有平安银行信用卡核心账务系统从0到1重构实战经验。</w:t>
+        <w:t>10年后端开发经验，其中8年深耕金融核心系统，具备信用卡核心账务系统从0到1重构与落地经验。</w:t>
       </w:r>
     </w:p>
     <w:p>
@@ -81,7 +81,7 @@
         <w:pStyle w:val="ListBullet"/>
       </w:pPr>
       <w:r>
-        <w:t>技术扎实，擅长攻坚：精通高并发批量设计，熟练批量作业优化，熟悉分布式与微服务开发。</w:t>
+        <w:t>技术攻坚能力强：擅长高并发批量设计与批处理作业优化，熟悉分布式系统与微服务架构实践。</w:t>
       </w:r>
     </w:p>
     <w:p>
@@ -89,7 +89,7 @@
         <w:pStyle w:val="ListBullet"/>
       </w:pPr>
       <w:r>
-        <w:t>业务理解深刻：精通银行账务等复杂金融业务逻辑，能够将业务需求高质量转化为稳健的技术方案。</w:t>
+        <w:t>业务理解扎实：熟悉银行账务、清算等复杂金融业务，能够将抽象业务规则转化为可落地、可维护的技术方案。</w:t>
       </w:r>
     </w:p>
     <w:p>
@@ -97,7 +97,7 @@
         <w:pStyle w:val="ListBullet"/>
       </w:pPr>
       <w:r>
-        <w:t>职业素养过硬：代码风格严谨、风险意识强，习惯通过Code Review和自动化测试保障交付质量。</w:t>
+        <w:t>质量与风险意识强：代码风格严谨，重视Code Review、自动化测试与生产稳定性保障。</w:t>
       </w:r>
     </w:p>
     <w:p/>
@@ -114,7 +114,7 @@
         <w:pStyle w:val="ListBullet"/>
       </w:pPr>
       <w:r>
-        <w:t>**编程语言/主流框架：** 精通Java；熟悉Spring Boot、Spring Cloud微服务生态；熟悉Spring Batch批处理框架。</w:t>
+        <w:t>**Java与框架：** 精通Java，熟悉Spring Boot、Spring Cloud、Spring Batch。</w:t>
       </w:r>
     </w:p>
     <w:p>
@@ -122,7 +122,7 @@
         <w:pStyle w:val="ListBullet"/>
       </w:pPr>
       <w:r>
-        <w:t>**数据库：** 熟悉MySQL数据库及SQL调优。</w:t>
+        <w:t>**数据库：** 熟悉MySQL及SQL调优。</w:t>
       </w:r>
     </w:p>
     <w:p>
@@ -130,7 +130,15 @@
         <w:pStyle w:val="ListBullet"/>
       </w:pPr>
       <w:r>
-        <w:t>**中间件：** 熟悉RocketMQ，用于解耦和异步处理。</w:t>
+        <w:t>**中间件：** 熟悉RocketMQ，具备异步解耦与削峰场景落地经验。</w:t>
+      </w:r>
+    </w:p>
+    <w:p>
+      <w:pPr>
+        <w:pStyle w:val="ListBullet"/>
+      </w:pPr>
+      <w:r>
+        <w:t>**工程实践：** 熟悉高并发设计、JVM调优、批量作业优化、生产问题排查与稳定性保障。</w:t>
       </w:r>
     </w:p>
     <w:p/>
@@ -158,13 +166,13 @@
     </w:p>
     <w:p>
       <w:r>
-        <w:t>**角色：** 作为核心骨干，主导信用卡核心账务系统的架构演进与生产稳定性保障。</w:t>
+        <w:t>**角色定位：** 核心骨干，主导信用卡核心账务系统架构演进与生产稳定性建设。</w:t>
       </w:r>
     </w:p>
     <w:p/>
     <w:p>
       <w:r>
-        <w:t>**核心职责：**</w:t>
+        <w:t>**核心职责与成果：**</w:t>
       </w:r>
     </w:p>
     <w:p>
@@ -172,7 +180,7 @@
         <w:pStyle w:val="ListBullet"/>
       </w:pPr>
       <w:r>
-        <w:t>**版本迭代管理：** 以版本经理角色主导单个版本全生命周期管理，协调多方资源，确保高质量交付。</w:t>
+        <w:t>**版本迭代管理：** 以版本经理角色主导单版本全生命周期管理，统筹研发、测试、运维等多方协作，保障版本高质量交付。</w:t>
       </w:r>
     </w:p>
     <w:p>
@@ -180,7 +188,7 @@
         <w:pStyle w:val="ListBullet"/>
       </w:pPr>
       <w:r>
-        <w:t>**生产稳定性保障：** 负责核心系统生产运维，通过全链路压测与JVM深度调优，成功保障多次年终结算及大促活动，系统可用性达到99.99%。</w:t>
+        <w:t>**稳定性与性能保障：** 负责核心系统生产运维，通过全链路压测和JVM深度调优，支撑多次年终结算及大促场景，系统可用性达到**99.99%**。</w:t>
       </w:r>
     </w:p>
     <w:p>
@@ -188,7 +196,7 @@
         <w:pStyle w:val="ListBullet"/>
       </w:pPr>
       <w:r>
-        <w:t>**技术难题攻关：** 主导旧系统向新云平台迁移过程中的数据一致性方案设计，开发自动化比对工具，成功迁移千万级历史账户数据，实现零丢失、零误差。</w:t>
+        <w:t>**迁移与一致性攻坚：** 主导旧系统上云迁移中的数据一致性方案设计，开发自动化比对工具，完成千万级历史账户数据迁移，达成**零丢失、零误差**。</w:t>
       </w:r>
     </w:p>
     <w:p/>
@@ -207,13 +215,13 @@
     </w:p>
     <w:p>
       <w:r>
-        <w:t>**项目背景：** 为应对业务高速增长，将原单体架构升级为基于“单元化+微服务”的现代化架构，涉及核心账务、清算等关键域，用户量级超千万。</w:t>
+        <w:t>**项目背景：** 面向业务高速增长场景，推动单体系统向“单元化+微服务”架构升级，覆盖核心账务、清算等关键领域，用户规模超千万。</w:t>
       </w:r>
     </w:p>
     <w:p/>
     <w:p>
       <w:r>
-        <w:t>**核心职责：**</w:t>
+        <w:t>**核心职责与成果：**</w:t>
       </w:r>
     </w:p>
     <w:p>
@@ -221,7 +229,7 @@
         <w:pStyle w:val="ListBullet"/>
       </w:pPr>
       <w:r>
-        <w:t>**核心模块设计与开发：** 负责核心账务模块的概要设计、详细设计及功能开发，确保系统满足复杂金融业务规则。</w:t>
+        <w:t>**核心模块建设：** 负责核心账务模块概要设计、详细设计与功能开发，保障复杂金融规则在系统中的准确落地。</w:t>
       </w:r>
     </w:p>
     <w:p>
@@ -229,7 +237,7 @@
         <w:pStyle w:val="ListBullet"/>
       </w:pPr>
       <w:r>
-        <w:t>**性能调优：** 针对核心账务模块进行性能瓶颈分析与优化，有效支撑高并发交易场景。</w:t>
+        <w:t>**高并发性能优化：** 针对核心账务链路进行瓶颈分析与性能调优，有效支撑高并发交易处理。</w:t>
       </w:r>
     </w:p>
     <w:p>
@@ -237,7 +245,7 @@
         <w:pStyle w:val="ListBullet"/>
       </w:pPr>
       <w:r>
-        <w:t>**数据迁移验证：** 通过数据回放比对技术，对新老系统进行全方位数据校验，为系统顺利投产提供关键保障。</w:t>
+        <w:t>**投产前一致性校验：** 通过数据回放比对方案完成新老系统全量校验，为系统平滑切换与投产提供关键保障。</w:t>
       </w:r>
     </w:p>
     <w:p>
@@ -245,7 +253,7 @@
         <w:pStyle w:val="ListBullet"/>
       </w:pPr>
       <w:r>
-        <w:t>**性能与稳定性：** 通过代码优化与SQL调优，显著提升核心账户系统处理能力，并全程参与生产重保，确保系统平稳运行。</w:t>
+        <w:t>**稳定性提升：** 通过代码优化与SQL调优提升账户系统处理能力，并参与生产重保，保障系统持续平稳运行。</w:t>
       </w:r>
     </w:p>
     <w:p/>
@@ -270,7 +278,7 @@
     <w:p/>
     <w:p>
       <w:r>
-        <w:t>**核心职责：**</w:t>
+        <w:t>**核心职责与成果：**</w:t>
       </w:r>
     </w:p>
     <w:p>
@@ -278,7 +286,7 @@
         <w:pStyle w:val="ListBullet"/>
       </w:pPr>
       <w:r>
-        <w:t>**支付系统对接：** 负责新支付渠道接入，设计完善的支付状态机，处理异步回调与网络超时等异常场景。</w:t>
+        <w:t>负责新支付渠道接入，设计支付状态机，妥善处理异步回调、网络超时等异常场景。</w:t>
       </w:r>
     </w:p>
     <w:p>
@@ -286,7 +294,7 @@
         <w:pStyle w:val="ListBullet"/>
       </w:pPr>
       <w:r>
-        <w:t>**电子凭证平台迁移：** 主导电子凭证模块接口迁移工作，无缝对接新老平台，降低系统耦合度并提升可维护性。</w:t>
+        <w:t>主导电子凭证模块接口迁移，无缝衔接新老平台，降低系统耦合度，提升可维护性。</w:t>
       </w:r>
     </w:p>
     <w:p/>
@@ -319,7 +327,7 @@
         <w:pStyle w:val="ListBullet"/>
       </w:pPr>
       <w:r>
-        <w:t>负责概要设计和详细设计文档撰写。</w:t>
+        <w:t>负责概要设计与详细设计文档编写。</w:t>
       </w:r>
     </w:p>
     <w:p>
@@ -335,7 +343,7 @@
         <w:pStyle w:val="ListBullet"/>
       </w:pPr>
       <w:r>
-        <w:t>负责功能开发及代码优化。</w:t>
+        <w:t>负责功能开发与代码优化。</w:t>
       </w:r>
     </w:p>
     <w:p/>

</xml_diff>

<commit_message>
Update resume company name to Shanghai Guozhi
Co-authored-by: xiaoxiaosongss <xiaoxiaosongss@users.noreply.github.com>
</commit_message>
<xml_diff>
--- a/gao-jiansong-java-resume.docx
+++ b/gao-jiansong-java-resume.docx
@@ -205,7 +205,7 @@
         <w:pStyle w:val="Heading3"/>
       </w:pPr>
       <w:r>
-        <w:t>北京江融信科技有限公司｜Java开发工程师</w:t>
+        <w:t>上海国智｜Java开发工程师</w:t>
       </w:r>
     </w:p>
     <w:p>
@@ -262,7 +262,7 @@
         <w:pStyle w:val="Heading3"/>
       </w:pPr>
       <w:r>
-        <w:t>上海艾融软件股份有限公司｜Java开发工程师</w:t>
+        <w:t>上海国智｜Java开发工程师</w:t>
       </w:r>
     </w:p>
     <w:p>

</xml_diff>